<commit_message>
chore: publish current project artifacts
</commit_message>
<xml_diff>
--- a/docs/ProjectVL_体验目标一页纸.docx
+++ b/docs/ProjectVL_体验目标一页纸.docx
@@ -29,7 +29,7 @@
           <w:sz w:val="18"/>
           <w:szCs w:val="18"/>
         </w:rPr>
-        <w:t xml:space="preserve">合成塔防原型 · 竞品调研驱动（2025–2026 市场数据）· 2026-07-09 · 2026-07-10 修订（受众／平台／反应形态／失败代价）</w:t>
+        <w:t xml:space="preserve">合成塔防原型 · 竞品调研驱动（2025–2026 市场数据）· 2026-07-09 · 2026-07-10 修订（受众／平台／反应形态／失败代价）· 2026-07-23 修订（单局改为 10 波，每波时长按比例缩短，单局总时长 10–14 分钟维持不变）</w:t>
       </w:r>
     </w:p>
     <w:p>
@@ -218,7 +218,7 @@
           <w:sz w:val="20"/>
           <w:szCs w:val="20"/>
         </w:rPr>
-        <w:t xml:space="preserve">结论：单局 10–14 分钟（目标中位 ≈ 12–13 分钟），8 波＋Boss；每波约 62–85 秒战斗＋20–30 秒呼吸口，Boss 约 100–120 秒。既保留幸存者like「完整一局」的成就闭环，又贴合移动碎片场景的单次时长上限。</w:t>
+        <w:t xml:space="preserve">结论：单局 10–14 分钟（目标中位 ≈ 12–13 分钟），10 波＋Boss；每波约 50–68 秒战斗＋16–24 秒呼吸口，Boss 约 100–120 秒。既保留幸存者like「完整一局」的成就闭环，又贴合移动碎片场景的单次时长上限。</w:t>
       </w:r>
     </w:p>
     <w:p>
@@ -295,7 +295,7 @@
           <w:sz w:val="20"/>
           <w:szCs w:val="20"/>
         </w:rPr>
-        <w:t xml:space="preserve">曲线为 8 段「战斗爬升 → 波末峰值 → 呼吸口回落」的锯齿，基线随波次抬升，Boss 前设一段蓄力谷再冲终局 climax。约束满足：张力峰值落在每波末与 Boss 前，波间为呼吸口。各点玩家心理与预期操作：</w:t>
+        <w:t xml:space="preserve">曲线为 10 段「战斗爬升 → 波末峰值 → 呼吸口回落」的锯齿，基线随波次抬升，Boss 前设一段蓄力谷再冲终局 climax。约束满足：张力峰值落在每波末与 Boss 前，波间为呼吸口。各点玩家心理与预期操作：</w:t>
       </w:r>
     </w:p>
     <w:p>

</xml_diff>